<commit_message>
Update Object Oriented Programming in Python.docx
</commit_message>
<xml_diff>
--- a/Day 1/OOP/Object Oriented Programming in Python.docx
+++ b/Day 1/OOP/Object Oriented Programming in Python.docx
@@ -3333,49 +3333,83 @@
       </w:pPr>
       <w:r>
         <w:lastRenderedPageBreak/>
-        <w:t>Class Attribute (Exam Definition)</w:t>
+        <w:t xml:space="preserve">Class Attribute </w:t>
       </w:r>
     </w:p>
     <w:p>
       <w:pPr>
         <w:pStyle w:val="NormalWeb"/>
-      </w:pPr>
-      <w:r>
+        <w:rPr>
+          <w:color w:val="FF0000"/>
+        </w:rPr>
+      </w:pPr>
+      <w:r>
+        <w:rPr>
+          <w:color w:val="FF0000"/>
+          <w:highlight w:val="yellow"/>
+        </w:rPr>
         <w:t xml:space="preserve">A </w:t>
       </w:r>
       <w:r>
         <w:rPr>
           <w:rStyle w:val="Strong"/>
           <w:rFonts w:eastAsiaTheme="majorEastAsia"/>
+          <w:color w:val="FF0000"/>
+          <w:highlight w:val="yellow"/>
         </w:rPr>
         <w:t>class attribute</w:t>
       </w:r>
       <w:r>
-        <w:t xml:space="preserve"> is </w:t>
-      </w:r>
-      <w:bookmarkStart w:id="0" w:name="_GoBack"/>
-      <w:bookmarkEnd w:id="0"/>
-      <w:r>
-        <w:t xml:space="preserve">a variable that belongs to the </w:t>
-      </w:r>
-      <w:r>
-        <w:rPr>
-          <w:rStyle w:val="Strong"/>
-          <w:rFonts w:eastAsiaTheme="majorEastAsia"/>
+        <w:rPr>
+          <w:color w:val="FF0000"/>
+          <w:highlight w:val="yellow"/>
+        </w:rPr>
+        <w:t xml:space="preserve"> is a variable that</w:t>
+      </w:r>
+      <w:r>
+        <w:rPr>
+          <w:color w:val="FF0000"/>
+          <w:highlight w:val="yellow"/>
+        </w:rPr>
+        <w:t xml:space="preserve"> directly</w:t>
+      </w:r>
+      <w:r>
+        <w:rPr>
+          <w:color w:val="FF0000"/>
+          <w:highlight w:val="yellow"/>
+        </w:rPr>
+        <w:t xml:space="preserve"> belongs to the </w:t>
+      </w:r>
+      <w:r>
+        <w:rPr>
+          <w:rStyle w:val="Strong"/>
+          <w:rFonts w:eastAsiaTheme="majorEastAsia"/>
+          <w:color w:val="FF0000"/>
+          <w:highlight w:val="yellow"/>
         </w:rPr>
         <w:t>class</w:t>
       </w:r>
       <w:r>
+        <w:rPr>
+          <w:color w:val="FF0000"/>
+          <w:highlight w:val="yellow"/>
+        </w:rPr>
         <w:t xml:space="preserve">. It is </w:t>
       </w:r>
       <w:r>
         <w:rPr>
           <w:rStyle w:val="Strong"/>
           <w:rFonts w:eastAsiaTheme="majorEastAsia"/>
+          <w:color w:val="FF0000"/>
+          <w:highlight w:val="yellow"/>
         </w:rPr>
         <w:t>shared by all objects</w:t>
       </w:r>
       <w:r>
+        <w:rPr>
+          <w:color w:val="FF0000"/>
+          <w:highlight w:val="yellow"/>
+        </w:rPr>
         <w:t xml:space="preserve"> of that class.</w:t>
       </w:r>
     </w:p>
@@ -3384,6 +3418,14 @@
         <w:pStyle w:val="NormalWeb"/>
       </w:pPr>
       <w:r>
+        <w:t>An attribute that belongs to the class rather than a particular object.</w:t>
+      </w:r>
+    </w:p>
+    <w:p>
+      <w:pPr>
+        <w:pStyle w:val="NormalWeb"/>
+      </w:pPr>
+      <w:r>
         <w:rPr>
           <w:rStyle w:val="Strong"/>
           <w:rFonts w:eastAsiaTheme="majorEastAsia"/>
@@ -3393,312 +3435,1118 @@
     </w:p>
     <w:p>
       <w:pPr>
-        <w:pStyle w:val="HTMLPreformatted"/>
-      </w:pPr>
-      <w:r>
-        <w:rPr>
-          <w:rStyle w:val="v"/>
-          <w:rFonts w:eastAsiaTheme="majorEastAsia"/>
+        <w:shd w:val="clear" w:color="auto" w:fill="121314"/>
+        <w:spacing w:after="0" w:line="285" w:lineRule="atLeast"/>
+        <w:jc w:val="left"/>
+        <w:rPr>
+          <w:rFonts w:ascii="Consolas" w:eastAsia="Times New Roman" w:hAnsi="Consolas" w:cs="Times New Roman"/>
+          <w:color w:val="BBBEBF"/>
+          <w:sz w:val="21"/>
+        </w:rPr>
+      </w:pPr>
+      <w:r>
+        <w:rPr>
+          <w:rFonts w:ascii="Consolas" w:eastAsia="Times New Roman" w:hAnsi="Consolas" w:cs="Times New Roman"/>
+          <w:color w:val="FF7B72"/>
+          <w:sz w:val="21"/>
         </w:rPr>
         <w:t>class</w:t>
       </w:r>
       <w:r>
         <w:rPr>
+          <w:rFonts w:ascii="Consolas" w:eastAsia="Times New Roman" w:hAnsi="Consolas" w:cs="Times New Roman"/>
+          <w:color w:val="BBBEBF"/>
+          <w:sz w:val="21"/>
+        </w:rPr>
+        <w:t xml:space="preserve"> </w:t>
+      </w:r>
+      <w:r>
+        <w:rPr>
+          <w:rFonts w:ascii="Consolas" w:eastAsia="Times New Roman" w:hAnsi="Consolas" w:cs="Times New Roman"/>
+          <w:color w:val="4EC9B0"/>
+          <w:sz w:val="21"/>
+        </w:rPr>
+        <w:t>Employee</w:t>
+      </w:r>
+      <w:r>
+        <w:rPr>
+          <w:rFonts w:ascii="Consolas" w:eastAsia="Times New Roman" w:hAnsi="Consolas" w:cs="Times New Roman"/>
+          <w:color w:val="BBBEBF"/>
+          <w:sz w:val="21"/>
+        </w:rPr>
+        <w:t>:</w:t>
+      </w:r>
+    </w:p>
+    <w:p>
+      <w:pPr>
+        <w:shd w:val="clear" w:color="auto" w:fill="121314"/>
+        <w:spacing w:after="0" w:line="285" w:lineRule="atLeast"/>
+        <w:jc w:val="left"/>
+        <w:rPr>
+          <w:rFonts w:ascii="Consolas" w:eastAsia="Times New Roman" w:hAnsi="Consolas" w:cs="Times New Roman"/>
+          <w:color w:val="BBBEBF"/>
+          <w:sz w:val="21"/>
+        </w:rPr>
+      </w:pPr>
+      <w:r>
+        <w:rPr>
+          <w:rFonts w:ascii="Consolas" w:eastAsia="Times New Roman" w:hAnsi="Consolas" w:cs="Times New Roman"/>
+          <w:color w:val="BBBEBF"/>
+          <w:sz w:val="21"/>
+        </w:rPr>
+        <w:t xml:space="preserve">    </w:t>
+      </w:r>
+      <w:r>
+        <w:rPr>
+          <w:rFonts w:ascii="Consolas" w:eastAsia="Times New Roman" w:hAnsi="Consolas" w:cs="Times New Roman"/>
+          <w:color w:val="C9D1D9"/>
+          <w:sz w:val="21"/>
+        </w:rPr>
+        <w:t>company</w:t>
+      </w:r>
+      <w:r>
+        <w:rPr>
+          <w:rFonts w:ascii="Consolas" w:eastAsia="Times New Roman" w:hAnsi="Consolas" w:cs="Times New Roman"/>
+          <w:color w:val="BBBEBF"/>
+          <w:sz w:val="21"/>
+        </w:rPr>
+        <w:t xml:space="preserve"> </w:t>
+      </w:r>
+      <w:r>
+        <w:rPr>
+          <w:rFonts w:ascii="Consolas" w:eastAsia="Times New Roman" w:hAnsi="Consolas" w:cs="Times New Roman"/>
+          <w:color w:val="D4D4D4"/>
+          <w:sz w:val="21"/>
+        </w:rPr>
+        <w:t>=</w:t>
+      </w:r>
+      <w:r>
+        <w:rPr>
+          <w:rFonts w:ascii="Consolas" w:eastAsia="Times New Roman" w:hAnsi="Consolas" w:cs="Times New Roman"/>
+          <w:color w:val="BBBEBF"/>
+          <w:sz w:val="21"/>
+        </w:rPr>
+        <w:t xml:space="preserve"> </w:t>
+      </w:r>
+      <w:r>
+        <w:rPr>
+          <w:rFonts w:ascii="Consolas" w:eastAsia="Times New Roman" w:hAnsi="Consolas" w:cs="Times New Roman"/>
+          <w:color w:val="A5D6FF"/>
+          <w:sz w:val="21"/>
+        </w:rPr>
+        <w:t>"Google"</w:t>
+      </w:r>
+      <w:r>
+        <w:rPr>
+          <w:rFonts w:ascii="Consolas" w:eastAsia="Times New Roman" w:hAnsi="Consolas" w:cs="Times New Roman"/>
+          <w:color w:val="BBBEBF"/>
+          <w:sz w:val="21"/>
+        </w:rPr>
+        <w:t xml:space="preserve">   </w:t>
+      </w:r>
+      <w:r>
+        <w:rPr>
+          <w:rFonts w:ascii="Consolas" w:eastAsia="Times New Roman" w:hAnsi="Consolas" w:cs="Times New Roman"/>
+          <w:color w:val="8B949E"/>
+          <w:sz w:val="21"/>
+        </w:rPr>
+        <w:t># Class attribute</w:t>
+      </w:r>
+    </w:p>
+    <w:p>
+      <w:pPr>
+        <w:shd w:val="clear" w:color="auto" w:fill="121314"/>
+        <w:spacing w:after="0" w:line="285" w:lineRule="atLeast"/>
+        <w:jc w:val="left"/>
+        <w:rPr>
+          <w:rFonts w:ascii="Consolas" w:eastAsia="Times New Roman" w:hAnsi="Consolas" w:cs="Times New Roman"/>
+          <w:color w:val="BBBEBF"/>
+          <w:sz w:val="21"/>
+        </w:rPr>
+      </w:pPr>
+    </w:p>
+    <w:p>
+      <w:pPr>
+        <w:shd w:val="clear" w:color="auto" w:fill="121314"/>
+        <w:spacing w:after="0" w:line="285" w:lineRule="atLeast"/>
+        <w:jc w:val="left"/>
+        <w:rPr>
+          <w:rFonts w:ascii="Consolas" w:eastAsia="Times New Roman" w:hAnsi="Consolas" w:cs="Times New Roman"/>
+          <w:color w:val="BBBEBF"/>
+          <w:sz w:val="21"/>
+        </w:rPr>
+      </w:pPr>
+      <w:r>
+        <w:rPr>
+          <w:rFonts w:ascii="Consolas" w:eastAsia="Times New Roman" w:hAnsi="Consolas" w:cs="Times New Roman"/>
+          <w:color w:val="C9D1D9"/>
+          <w:sz w:val="21"/>
+        </w:rPr>
+        <w:t>emp1</w:t>
+      </w:r>
+      <w:r>
+        <w:rPr>
+          <w:rFonts w:ascii="Consolas" w:eastAsia="Times New Roman" w:hAnsi="Consolas" w:cs="Times New Roman"/>
+          <w:color w:val="BBBEBF"/>
+          <w:sz w:val="21"/>
+        </w:rPr>
+        <w:t xml:space="preserve"> </w:t>
+      </w:r>
+      <w:r>
+        <w:rPr>
+          <w:rFonts w:ascii="Consolas" w:eastAsia="Times New Roman" w:hAnsi="Consolas" w:cs="Times New Roman"/>
+          <w:color w:val="D4D4D4"/>
+          <w:sz w:val="21"/>
+        </w:rPr>
+        <w:t>=</w:t>
+      </w:r>
+      <w:r>
+        <w:rPr>
+          <w:rFonts w:ascii="Consolas" w:eastAsia="Times New Roman" w:hAnsi="Consolas" w:cs="Times New Roman"/>
+          <w:color w:val="BBBEBF"/>
+          <w:sz w:val="21"/>
+        </w:rPr>
+        <w:t xml:space="preserve"> </w:t>
+      </w:r>
+      <w:proofErr w:type="gramStart"/>
+      <w:r>
+        <w:rPr>
+          <w:rFonts w:ascii="Consolas" w:eastAsia="Times New Roman" w:hAnsi="Consolas" w:cs="Times New Roman"/>
+          <w:color w:val="4EC9B0"/>
+          <w:sz w:val="21"/>
+        </w:rPr>
+        <w:t>Employee</w:t>
+      </w:r>
+      <w:r>
+        <w:rPr>
+          <w:rFonts w:ascii="Consolas" w:eastAsia="Times New Roman" w:hAnsi="Consolas" w:cs="Times New Roman"/>
+          <w:color w:val="BBBEBF"/>
+          <w:sz w:val="21"/>
+        </w:rPr>
+        <w:t>(</w:t>
+      </w:r>
+      <w:proofErr w:type="gramEnd"/>
+      <w:r>
+        <w:rPr>
+          <w:rFonts w:ascii="Consolas" w:eastAsia="Times New Roman" w:hAnsi="Consolas" w:cs="Times New Roman"/>
+          <w:color w:val="BBBEBF"/>
+          <w:sz w:val="21"/>
+        </w:rPr>
+        <w:t>)</w:t>
+      </w:r>
+    </w:p>
+    <w:p>
+      <w:pPr>
+        <w:shd w:val="clear" w:color="auto" w:fill="121314"/>
+        <w:spacing w:after="0" w:line="285" w:lineRule="atLeast"/>
+        <w:jc w:val="left"/>
+        <w:rPr>
+          <w:rFonts w:ascii="Consolas" w:eastAsia="Times New Roman" w:hAnsi="Consolas" w:cs="Times New Roman"/>
+          <w:color w:val="BBBEBF"/>
+          <w:sz w:val="21"/>
+        </w:rPr>
+      </w:pPr>
+      <w:r>
+        <w:rPr>
+          <w:rFonts w:ascii="Consolas" w:eastAsia="Times New Roman" w:hAnsi="Consolas" w:cs="Times New Roman"/>
+          <w:color w:val="C9D1D9"/>
+          <w:sz w:val="21"/>
+        </w:rPr>
+        <w:t>emp2</w:t>
+      </w:r>
+      <w:r>
+        <w:rPr>
+          <w:rFonts w:ascii="Consolas" w:eastAsia="Times New Roman" w:hAnsi="Consolas" w:cs="Times New Roman"/>
+          <w:color w:val="BBBEBF"/>
+          <w:sz w:val="21"/>
+        </w:rPr>
+        <w:t xml:space="preserve"> </w:t>
+      </w:r>
+      <w:r>
+        <w:rPr>
+          <w:rFonts w:ascii="Consolas" w:eastAsia="Times New Roman" w:hAnsi="Consolas" w:cs="Times New Roman"/>
+          <w:color w:val="D4D4D4"/>
+          <w:sz w:val="21"/>
+        </w:rPr>
+        <w:t>=</w:t>
+      </w:r>
+      <w:r>
+        <w:rPr>
+          <w:rFonts w:ascii="Consolas" w:eastAsia="Times New Roman" w:hAnsi="Consolas" w:cs="Times New Roman"/>
+          <w:color w:val="BBBEBF"/>
+          <w:sz w:val="21"/>
+        </w:rPr>
+        <w:t xml:space="preserve"> </w:t>
+      </w:r>
+      <w:proofErr w:type="gramStart"/>
+      <w:r>
+        <w:rPr>
+          <w:rFonts w:ascii="Consolas" w:eastAsia="Times New Roman" w:hAnsi="Consolas" w:cs="Times New Roman"/>
+          <w:color w:val="4EC9B0"/>
+          <w:sz w:val="21"/>
+        </w:rPr>
+        <w:t>Employee</w:t>
+      </w:r>
+      <w:r>
+        <w:rPr>
+          <w:rFonts w:ascii="Consolas" w:eastAsia="Times New Roman" w:hAnsi="Consolas" w:cs="Times New Roman"/>
+          <w:color w:val="BBBEBF"/>
+          <w:sz w:val="21"/>
+        </w:rPr>
+        <w:t>(</w:t>
+      </w:r>
+      <w:proofErr w:type="gramEnd"/>
+      <w:r>
+        <w:rPr>
+          <w:rFonts w:ascii="Consolas" w:eastAsia="Times New Roman" w:hAnsi="Consolas" w:cs="Times New Roman"/>
+          <w:color w:val="BBBEBF"/>
+          <w:sz w:val="21"/>
+        </w:rPr>
+        <w:t>)</w:t>
+      </w:r>
+    </w:p>
+    <w:p>
+      <w:pPr>
+        <w:shd w:val="clear" w:color="auto" w:fill="121314"/>
+        <w:spacing w:after="0" w:line="285" w:lineRule="atLeast"/>
+        <w:jc w:val="left"/>
+        <w:rPr>
+          <w:rFonts w:ascii="Consolas" w:eastAsia="Times New Roman" w:hAnsi="Consolas" w:cs="Times New Roman"/>
+          <w:color w:val="BBBEBF"/>
+          <w:sz w:val="21"/>
+        </w:rPr>
+      </w:pPr>
+    </w:p>
+    <w:p>
+      <w:pPr>
+        <w:shd w:val="clear" w:color="auto" w:fill="121314"/>
+        <w:spacing w:after="0" w:line="285" w:lineRule="atLeast"/>
+        <w:jc w:val="left"/>
+        <w:rPr>
+          <w:rFonts w:ascii="Consolas" w:eastAsia="Times New Roman" w:hAnsi="Consolas" w:cs="Times New Roman"/>
+          <w:color w:val="BBBEBF"/>
+          <w:sz w:val="21"/>
+        </w:rPr>
+      </w:pPr>
+      <w:proofErr w:type="gramStart"/>
+      <w:r>
+        <w:rPr>
+          <w:rFonts w:ascii="Consolas" w:eastAsia="Times New Roman" w:hAnsi="Consolas" w:cs="Times New Roman"/>
+          <w:color w:val="D2A8FF"/>
+          <w:sz w:val="21"/>
+        </w:rPr>
+        <w:t>print</w:t>
+      </w:r>
+      <w:r>
+        <w:rPr>
+          <w:rFonts w:ascii="Consolas" w:eastAsia="Times New Roman" w:hAnsi="Consolas" w:cs="Times New Roman"/>
+          <w:color w:val="BBBEBF"/>
+          <w:sz w:val="21"/>
+        </w:rPr>
+        <w:t>(</w:t>
+      </w:r>
+      <w:proofErr w:type="gramEnd"/>
+      <w:r>
+        <w:rPr>
+          <w:rFonts w:ascii="Consolas" w:eastAsia="Times New Roman" w:hAnsi="Consolas" w:cs="Times New Roman"/>
+          <w:color w:val="C9D1D9"/>
+          <w:sz w:val="21"/>
+        </w:rPr>
+        <w:t>emp1</w:t>
+      </w:r>
+      <w:r>
+        <w:rPr>
+          <w:rFonts w:ascii="Consolas" w:eastAsia="Times New Roman" w:hAnsi="Consolas" w:cs="Times New Roman"/>
+          <w:color w:val="BBBEBF"/>
+          <w:sz w:val="21"/>
+        </w:rPr>
+        <w:t>.</w:t>
+      </w:r>
+      <w:r>
+        <w:rPr>
+          <w:rFonts w:ascii="Consolas" w:eastAsia="Times New Roman" w:hAnsi="Consolas" w:cs="Times New Roman"/>
+          <w:color w:val="C9D1D9"/>
+          <w:sz w:val="21"/>
+        </w:rPr>
+        <w:t>company</w:t>
+      </w:r>
+      <w:r>
+        <w:rPr>
+          <w:rFonts w:ascii="Consolas" w:eastAsia="Times New Roman" w:hAnsi="Consolas" w:cs="Times New Roman"/>
+          <w:color w:val="BBBEBF"/>
+          <w:sz w:val="21"/>
+        </w:rPr>
+        <w:t xml:space="preserve">)   </w:t>
+      </w:r>
+      <w:r>
+        <w:rPr>
+          <w:rFonts w:ascii="Consolas" w:eastAsia="Times New Roman" w:hAnsi="Consolas" w:cs="Times New Roman"/>
+          <w:color w:val="8B949E"/>
+          <w:sz w:val="21"/>
+        </w:rPr>
+        <w:t># Google</w:t>
+      </w:r>
+    </w:p>
+    <w:p>
+      <w:pPr>
+        <w:shd w:val="clear" w:color="auto" w:fill="121314"/>
+        <w:spacing w:after="0" w:line="285" w:lineRule="atLeast"/>
+        <w:jc w:val="left"/>
+        <w:rPr>
+          <w:rFonts w:ascii="Consolas" w:eastAsia="Times New Roman" w:hAnsi="Consolas" w:cs="Times New Roman"/>
+          <w:color w:val="BBBEBF"/>
+          <w:sz w:val="21"/>
+        </w:rPr>
+      </w:pPr>
+      <w:proofErr w:type="gramStart"/>
+      <w:r>
+        <w:rPr>
+          <w:rFonts w:ascii="Consolas" w:eastAsia="Times New Roman" w:hAnsi="Consolas" w:cs="Times New Roman"/>
+          <w:color w:val="D2A8FF"/>
+          <w:sz w:val="21"/>
+        </w:rPr>
+        <w:t>print</w:t>
+      </w:r>
+      <w:r>
+        <w:rPr>
+          <w:rFonts w:ascii="Consolas" w:eastAsia="Times New Roman" w:hAnsi="Consolas" w:cs="Times New Roman"/>
+          <w:color w:val="BBBEBF"/>
+          <w:sz w:val="21"/>
+        </w:rPr>
+        <w:t>(</w:t>
+      </w:r>
+      <w:proofErr w:type="gramEnd"/>
+      <w:r>
+        <w:rPr>
+          <w:rFonts w:ascii="Consolas" w:eastAsia="Times New Roman" w:hAnsi="Consolas" w:cs="Times New Roman"/>
+          <w:color w:val="C9D1D9"/>
+          <w:sz w:val="21"/>
+        </w:rPr>
+        <w:t>emp2</w:t>
+      </w:r>
+      <w:r>
+        <w:rPr>
+          <w:rFonts w:ascii="Consolas" w:eastAsia="Times New Roman" w:hAnsi="Consolas" w:cs="Times New Roman"/>
+          <w:color w:val="BBBEBF"/>
+          <w:sz w:val="21"/>
+        </w:rPr>
+        <w:t>.</w:t>
+      </w:r>
+      <w:r>
+        <w:rPr>
+          <w:rFonts w:ascii="Consolas" w:eastAsia="Times New Roman" w:hAnsi="Consolas" w:cs="Times New Roman"/>
+          <w:color w:val="C9D1D9"/>
+          <w:sz w:val="21"/>
+        </w:rPr>
+        <w:t>company</w:t>
+      </w:r>
+      <w:r>
+        <w:rPr>
+          <w:rFonts w:ascii="Consolas" w:eastAsia="Times New Roman" w:hAnsi="Consolas" w:cs="Times New Roman"/>
+          <w:color w:val="BBBEBF"/>
+          <w:sz w:val="21"/>
+        </w:rPr>
+        <w:t xml:space="preserve">)   </w:t>
+      </w:r>
+      <w:r>
+        <w:rPr>
+          <w:rFonts w:ascii="Consolas" w:eastAsia="Times New Roman" w:hAnsi="Consolas" w:cs="Times New Roman"/>
+          <w:color w:val="8B949E"/>
+          <w:sz w:val="21"/>
+        </w:rPr>
+        <w:t># Google</w:t>
+      </w:r>
+    </w:p>
+    <w:p>
+      <w:pPr>
+        <w:shd w:val="clear" w:color="auto" w:fill="121314"/>
+        <w:spacing w:after="0" w:line="285" w:lineRule="atLeast"/>
+        <w:jc w:val="left"/>
+        <w:rPr>
+          <w:rFonts w:ascii="Consolas" w:eastAsia="Times New Roman" w:hAnsi="Consolas" w:cs="Times New Roman"/>
+          <w:color w:val="BBBEBF"/>
+          <w:sz w:val="21"/>
+        </w:rPr>
+      </w:pPr>
+    </w:p>
+    <w:p>
+      <w:pPr>
+        <w:pStyle w:val="NormalWeb"/>
+      </w:pPr>
+      <w:r>
+        <w:t xml:space="preserve">Both </w:t>
+      </w:r>
+      <w:r>
+        <w:rPr>
           <w:rStyle w:val="HTMLCode"/>
           <w:rFonts w:eastAsiaTheme="majorEastAsia"/>
         </w:rPr>
+        <w:t>emp1</w:t>
+      </w:r>
+      <w:r>
+        <w:t xml:space="preserve"> and </w:t>
+      </w:r>
+      <w:r>
+        <w:rPr>
+          <w:rStyle w:val="HTMLCode"/>
+          <w:rFonts w:eastAsiaTheme="majorEastAsia"/>
+        </w:rPr>
+        <w:t>emp2</w:t>
+      </w:r>
+      <w:r>
+        <w:t xml:space="preserve"> share the same </w:t>
+      </w:r>
+      <w:r>
+        <w:rPr>
+          <w:rStyle w:val="HTMLCode"/>
+          <w:rFonts w:eastAsiaTheme="majorEastAsia"/>
+        </w:rPr>
+        <w:t>company</w:t>
+      </w:r>
+      <w:r>
+        <w:t xml:space="preserve"> value.</w:t>
+      </w:r>
+    </w:p>
+    <w:p>
+      <w:pPr>
+        <w:pStyle w:val="Heading2"/>
+      </w:pPr>
+      <w:r>
+        <w:t xml:space="preserve">Object (Instance) Attribute </w:t>
+      </w:r>
+    </w:p>
+    <w:p>
+      <w:pPr>
+        <w:pStyle w:val="NormalWeb"/>
+      </w:pPr>
+      <w:r>
+        <w:t xml:space="preserve">An </w:t>
+      </w:r>
+      <w:r>
+        <w:rPr>
+          <w:rStyle w:val="Strong"/>
+          <w:rFonts w:eastAsiaTheme="majorEastAsia"/>
+        </w:rPr>
+        <w:t>object attribute</w:t>
+      </w:r>
+      <w:r>
+        <w:t xml:space="preserve"> (or </w:t>
+      </w:r>
+      <w:r>
+        <w:rPr>
+          <w:rStyle w:val="Strong"/>
+          <w:rFonts w:eastAsiaTheme="majorEastAsia"/>
+        </w:rPr>
+        <w:t>instance attribute</w:t>
+      </w:r>
+      <w:r>
+        <w:t xml:space="preserve">) is a variable that belongs to a </w:t>
+      </w:r>
+      <w:r>
+        <w:rPr>
+          <w:rStyle w:val="Strong"/>
+          <w:rFonts w:eastAsiaTheme="majorEastAsia"/>
+        </w:rPr>
+        <w:t>specific object</w:t>
+      </w:r>
+      <w:r>
+        <w:t xml:space="preserve">. Each object can have its </w:t>
+      </w:r>
+      <w:r>
+        <w:rPr>
+          <w:rStyle w:val="Strong"/>
+          <w:rFonts w:eastAsiaTheme="majorEastAsia"/>
+        </w:rPr>
+        <w:t>own different value</w:t>
+      </w:r>
+      <w:r>
+        <w:t>.</w:t>
+      </w:r>
+    </w:p>
+    <w:p>
+      <w:pPr>
+        <w:pStyle w:val="NormalWeb"/>
+      </w:pPr>
+      <w:r>
+        <w:rPr>
+          <w:rStyle w:val="Strong"/>
+          <w:rFonts w:eastAsiaTheme="majorEastAsia"/>
+        </w:rPr>
+        <w:t>Example:</w:t>
+      </w:r>
+    </w:p>
+    <w:p>
+      <w:pPr>
+        <w:shd w:val="clear" w:color="auto" w:fill="121314"/>
+        <w:spacing w:after="0" w:line="285" w:lineRule="atLeast"/>
+        <w:jc w:val="left"/>
+        <w:rPr>
+          <w:rFonts w:ascii="Consolas" w:eastAsia="Times New Roman" w:hAnsi="Consolas" w:cs="Times New Roman"/>
+          <w:color w:val="BBBEBF"/>
+          <w:sz w:val="21"/>
+        </w:rPr>
+      </w:pPr>
+      <w:r>
+        <w:rPr>
+          <w:rFonts w:ascii="Consolas" w:eastAsia="Times New Roman" w:hAnsi="Consolas" w:cs="Times New Roman"/>
+          <w:color w:val="FF7B72"/>
+          <w:sz w:val="21"/>
+        </w:rPr>
+        <w:t>class</w:t>
+      </w:r>
+      <w:r>
+        <w:rPr>
+          <w:rFonts w:ascii="Consolas" w:eastAsia="Times New Roman" w:hAnsi="Consolas" w:cs="Times New Roman"/>
+          <w:color w:val="BBBEBF"/>
+          <w:sz w:val="21"/>
+        </w:rPr>
         <w:t xml:space="preserve"> </w:t>
       </w:r>
       <w:r>
         <w:rPr>
-          <w:rStyle w:val="10"/>
-          <w:rFonts w:eastAsiaTheme="majorEastAsia"/>
+          <w:rFonts w:ascii="Consolas" w:eastAsia="Times New Roman" w:hAnsi="Consolas" w:cs="Times New Roman"/>
+          <w:color w:val="4EC9B0"/>
+          <w:sz w:val="21"/>
         </w:rPr>
         <w:t>Employee</w:t>
       </w:r>
       <w:r>
         <w:rPr>
+          <w:rFonts w:ascii="Consolas" w:eastAsia="Times New Roman" w:hAnsi="Consolas" w:cs="Times New Roman"/>
+          <w:color w:val="BBBEBF"/>
+          <w:sz w:val="21"/>
+        </w:rPr>
+        <w:t>:</w:t>
+      </w:r>
+    </w:p>
+    <w:p>
+      <w:pPr>
+        <w:shd w:val="clear" w:color="auto" w:fill="121314"/>
+        <w:spacing w:after="0" w:line="285" w:lineRule="atLeast"/>
+        <w:jc w:val="left"/>
+        <w:rPr>
+          <w:rFonts w:ascii="Consolas" w:eastAsia="Times New Roman" w:hAnsi="Consolas" w:cs="Times New Roman"/>
+          <w:color w:val="BBBEBF"/>
+          <w:sz w:val="21"/>
+        </w:rPr>
+      </w:pPr>
+      <w:r>
+        <w:rPr>
+          <w:rFonts w:ascii="Consolas" w:eastAsia="Times New Roman" w:hAnsi="Consolas" w:cs="Times New Roman"/>
+          <w:color w:val="BBBEBF"/>
+          <w:sz w:val="21"/>
+        </w:rPr>
+        <w:t xml:space="preserve">    </w:t>
+      </w:r>
+      <w:r>
+        <w:rPr>
+          <w:rFonts w:ascii="Consolas" w:eastAsia="Times New Roman" w:hAnsi="Consolas" w:cs="Times New Roman"/>
+          <w:color w:val="C9D1D9"/>
+          <w:sz w:val="21"/>
+        </w:rPr>
+        <w:t>company</w:t>
+      </w:r>
+      <w:r>
+        <w:rPr>
+          <w:rFonts w:ascii="Consolas" w:eastAsia="Times New Roman" w:hAnsi="Consolas" w:cs="Times New Roman"/>
+          <w:color w:val="BBBEBF"/>
+          <w:sz w:val="21"/>
+        </w:rPr>
+        <w:t xml:space="preserve"> </w:t>
+      </w:r>
+      <w:r>
+        <w:rPr>
+          <w:rFonts w:ascii="Consolas" w:eastAsia="Times New Roman" w:hAnsi="Consolas" w:cs="Times New Roman"/>
+          <w:color w:val="D4D4D4"/>
+          <w:sz w:val="21"/>
+        </w:rPr>
+        <w:t>=</w:t>
+      </w:r>
+      <w:r>
+        <w:rPr>
+          <w:rFonts w:ascii="Consolas" w:eastAsia="Times New Roman" w:hAnsi="Consolas" w:cs="Times New Roman"/>
+          <w:color w:val="BBBEBF"/>
+          <w:sz w:val="21"/>
+        </w:rPr>
+        <w:t xml:space="preserve"> </w:t>
+      </w:r>
+      <w:r>
+        <w:rPr>
+          <w:rFonts w:ascii="Consolas" w:eastAsia="Times New Roman" w:hAnsi="Consolas" w:cs="Times New Roman"/>
+          <w:color w:val="A5D6FF"/>
+          <w:sz w:val="21"/>
+        </w:rPr>
+        <w:t>"Google"</w:t>
+      </w:r>
+      <w:r>
+        <w:rPr>
+          <w:rFonts w:ascii="Consolas" w:eastAsia="Times New Roman" w:hAnsi="Consolas" w:cs="Times New Roman"/>
+          <w:color w:val="BBBEBF"/>
+          <w:sz w:val="21"/>
+        </w:rPr>
+        <w:t xml:space="preserve">   </w:t>
+      </w:r>
+      <w:r>
+        <w:rPr>
+          <w:rFonts w:ascii="Consolas" w:eastAsia="Times New Roman" w:hAnsi="Consolas" w:cs="Times New Roman"/>
+          <w:color w:val="8B949E"/>
+          <w:sz w:val="21"/>
+        </w:rPr>
+        <w:t># Class attribute</w:t>
+      </w:r>
+    </w:p>
+    <w:p>
+      <w:pPr>
+        <w:shd w:val="clear" w:color="auto" w:fill="121314"/>
+        <w:spacing w:after="0" w:line="285" w:lineRule="atLeast"/>
+        <w:jc w:val="left"/>
+        <w:rPr>
+          <w:rFonts w:ascii="Consolas" w:eastAsia="Times New Roman" w:hAnsi="Consolas" w:cs="Times New Roman"/>
+          <w:color w:val="BBBEBF"/>
+          <w:sz w:val="21"/>
+        </w:rPr>
+      </w:pPr>
+    </w:p>
+    <w:p>
+      <w:pPr>
+        <w:shd w:val="clear" w:color="auto" w:fill="121314"/>
+        <w:spacing w:after="0" w:line="285" w:lineRule="atLeast"/>
+        <w:jc w:val="left"/>
+        <w:rPr>
+          <w:rFonts w:ascii="Consolas" w:eastAsia="Times New Roman" w:hAnsi="Consolas" w:cs="Times New Roman"/>
+          <w:color w:val="BBBEBF"/>
+          <w:sz w:val="21"/>
+        </w:rPr>
+      </w:pPr>
+      <w:r>
+        <w:rPr>
+          <w:rFonts w:ascii="Consolas" w:eastAsia="Times New Roman" w:hAnsi="Consolas" w:cs="Times New Roman"/>
+          <w:color w:val="C9D1D9"/>
+          <w:sz w:val="21"/>
+        </w:rPr>
+        <w:t>emp1</w:t>
+      </w:r>
+      <w:r>
+        <w:rPr>
+          <w:rFonts w:ascii="Consolas" w:eastAsia="Times New Roman" w:hAnsi="Consolas" w:cs="Times New Roman"/>
+          <w:color w:val="BBBEBF"/>
+          <w:sz w:val="21"/>
+        </w:rPr>
+        <w:t xml:space="preserve"> </w:t>
+      </w:r>
+      <w:r>
+        <w:rPr>
+          <w:rFonts w:ascii="Consolas" w:eastAsia="Times New Roman" w:hAnsi="Consolas" w:cs="Times New Roman"/>
+          <w:color w:val="D4D4D4"/>
+          <w:sz w:val="21"/>
+        </w:rPr>
+        <w:t>=</w:t>
+      </w:r>
+      <w:r>
+        <w:rPr>
+          <w:rFonts w:ascii="Consolas" w:eastAsia="Times New Roman" w:hAnsi="Consolas" w:cs="Times New Roman"/>
+          <w:color w:val="BBBEBF"/>
+          <w:sz w:val="21"/>
+        </w:rPr>
+        <w:t xml:space="preserve"> </w:t>
+      </w:r>
+      <w:proofErr w:type="gramStart"/>
+      <w:r>
+        <w:rPr>
+          <w:rFonts w:ascii="Consolas" w:eastAsia="Times New Roman" w:hAnsi="Consolas" w:cs="Times New Roman"/>
+          <w:color w:val="4EC9B0"/>
+          <w:sz w:val="21"/>
+        </w:rPr>
+        <w:t>Employee</w:t>
+      </w:r>
+      <w:r>
+        <w:rPr>
+          <w:rFonts w:ascii="Consolas" w:eastAsia="Times New Roman" w:hAnsi="Consolas" w:cs="Times New Roman"/>
+          <w:color w:val="BBBEBF"/>
+          <w:sz w:val="21"/>
+        </w:rPr>
+        <w:t>(</w:t>
+      </w:r>
+      <w:proofErr w:type="gramEnd"/>
+      <w:r>
+        <w:rPr>
+          <w:rFonts w:ascii="Consolas" w:eastAsia="Times New Roman" w:hAnsi="Consolas" w:cs="Times New Roman"/>
+          <w:color w:val="BBBEBF"/>
+          <w:sz w:val="21"/>
+        </w:rPr>
+        <w:t>)</w:t>
+      </w:r>
+    </w:p>
+    <w:p>
+      <w:pPr>
+        <w:shd w:val="clear" w:color="auto" w:fill="121314"/>
+        <w:spacing w:after="0" w:line="285" w:lineRule="atLeast"/>
+        <w:jc w:val="left"/>
+        <w:rPr>
+          <w:rFonts w:ascii="Consolas" w:eastAsia="Times New Roman" w:hAnsi="Consolas" w:cs="Times New Roman"/>
+          <w:color w:val="BBBEBF"/>
+          <w:sz w:val="21"/>
+        </w:rPr>
+      </w:pPr>
+      <w:r>
+        <w:rPr>
+          <w:rFonts w:ascii="Consolas" w:eastAsia="Times New Roman" w:hAnsi="Consolas" w:cs="Times New Roman"/>
+          <w:color w:val="C9D1D9"/>
+          <w:sz w:val="21"/>
+        </w:rPr>
+        <w:t>emp2</w:t>
+      </w:r>
+      <w:r>
+        <w:rPr>
+          <w:rFonts w:ascii="Consolas" w:eastAsia="Times New Roman" w:hAnsi="Consolas" w:cs="Times New Roman"/>
+          <w:color w:val="BBBEBF"/>
+          <w:sz w:val="21"/>
+        </w:rPr>
+        <w:t xml:space="preserve"> </w:t>
+      </w:r>
+      <w:r>
+        <w:rPr>
+          <w:rFonts w:ascii="Consolas" w:eastAsia="Times New Roman" w:hAnsi="Consolas" w:cs="Times New Roman"/>
+          <w:color w:val="D4D4D4"/>
+          <w:sz w:val="21"/>
+        </w:rPr>
+        <w:t>=</w:t>
+      </w:r>
+      <w:r>
+        <w:rPr>
+          <w:rFonts w:ascii="Consolas" w:eastAsia="Times New Roman" w:hAnsi="Consolas" w:cs="Times New Roman"/>
+          <w:color w:val="BBBEBF"/>
+          <w:sz w:val="21"/>
+        </w:rPr>
+        <w:t xml:space="preserve"> </w:t>
+      </w:r>
+      <w:proofErr w:type="gramStart"/>
+      <w:r>
+        <w:rPr>
+          <w:rFonts w:ascii="Consolas" w:eastAsia="Times New Roman" w:hAnsi="Consolas" w:cs="Times New Roman"/>
+          <w:color w:val="4EC9B0"/>
+          <w:sz w:val="21"/>
+        </w:rPr>
+        <w:t>Employee</w:t>
+      </w:r>
+      <w:r>
+        <w:rPr>
+          <w:rFonts w:ascii="Consolas" w:eastAsia="Times New Roman" w:hAnsi="Consolas" w:cs="Times New Roman"/>
+          <w:color w:val="BBBEBF"/>
+          <w:sz w:val="21"/>
+        </w:rPr>
+        <w:t>(</w:t>
+      </w:r>
+      <w:proofErr w:type="gramEnd"/>
+      <w:r>
+        <w:rPr>
+          <w:rFonts w:ascii="Consolas" w:eastAsia="Times New Roman" w:hAnsi="Consolas" w:cs="Times New Roman"/>
+          <w:color w:val="BBBEBF"/>
+          <w:sz w:val="21"/>
+        </w:rPr>
+        <w:t>)</w:t>
+      </w:r>
+    </w:p>
+    <w:p>
+      <w:pPr>
+        <w:shd w:val="clear" w:color="auto" w:fill="121314"/>
+        <w:spacing w:after="0" w:line="285" w:lineRule="atLeast"/>
+        <w:jc w:val="left"/>
+        <w:rPr>
+          <w:rFonts w:ascii="Consolas" w:eastAsia="Times New Roman" w:hAnsi="Consolas" w:cs="Times New Roman"/>
+          <w:color w:val="BBBEBF"/>
+          <w:sz w:val="21"/>
+        </w:rPr>
+      </w:pPr>
+    </w:p>
+    <w:p>
+      <w:pPr>
+        <w:shd w:val="clear" w:color="auto" w:fill="121314"/>
+        <w:spacing w:after="0" w:line="285" w:lineRule="atLeast"/>
+        <w:jc w:val="left"/>
+        <w:rPr>
+          <w:rFonts w:ascii="Consolas" w:eastAsia="Times New Roman" w:hAnsi="Consolas" w:cs="Times New Roman"/>
+          <w:color w:val="BBBEBF"/>
+          <w:sz w:val="21"/>
+        </w:rPr>
+      </w:pPr>
+      <w:r>
+        <w:rPr>
+          <w:rFonts w:ascii="Consolas" w:eastAsia="Times New Roman" w:hAnsi="Consolas" w:cs="Times New Roman"/>
+          <w:color w:val="C9D1D9"/>
+          <w:sz w:val="21"/>
+        </w:rPr>
+        <w:t>emp1</w:t>
+      </w:r>
+      <w:r>
+        <w:rPr>
+          <w:rFonts w:ascii="Consolas" w:eastAsia="Times New Roman" w:hAnsi="Consolas" w:cs="Times New Roman"/>
+          <w:color w:val="BBBEBF"/>
+          <w:sz w:val="21"/>
+        </w:rPr>
+        <w:t xml:space="preserve">.name </w:t>
+      </w:r>
+      <w:r>
+        <w:rPr>
+          <w:rFonts w:ascii="Consolas" w:eastAsia="Times New Roman" w:hAnsi="Consolas" w:cs="Times New Roman"/>
+          <w:color w:val="D4D4D4"/>
+          <w:sz w:val="21"/>
+        </w:rPr>
+        <w:t>=</w:t>
+      </w:r>
+      <w:r>
+        <w:rPr>
+          <w:rFonts w:ascii="Consolas" w:eastAsia="Times New Roman" w:hAnsi="Consolas" w:cs="Times New Roman"/>
+          <w:color w:val="BBBEBF"/>
+          <w:sz w:val="21"/>
+        </w:rPr>
+        <w:t xml:space="preserve"> </w:t>
+      </w:r>
+      <w:r>
+        <w:rPr>
+          <w:rFonts w:ascii="Consolas" w:eastAsia="Times New Roman" w:hAnsi="Consolas" w:cs="Times New Roman"/>
+          <w:color w:val="A5D6FF"/>
+          <w:sz w:val="21"/>
+        </w:rPr>
+        <w:t>"Maryam"</w:t>
+      </w:r>
+      <w:r>
+        <w:rPr>
+          <w:rFonts w:ascii="Consolas" w:eastAsia="Times New Roman" w:hAnsi="Consolas" w:cs="Times New Roman"/>
+          <w:color w:val="BBBEBF"/>
+          <w:sz w:val="21"/>
+        </w:rPr>
+        <w:t xml:space="preserve"> </w:t>
+      </w:r>
+      <w:r>
+        <w:rPr>
+          <w:rFonts w:ascii="Consolas" w:eastAsia="Times New Roman" w:hAnsi="Consolas" w:cs="Times New Roman"/>
+          <w:color w:val="8B949E"/>
+          <w:sz w:val="21"/>
+        </w:rPr>
+        <w:t># instance attribute</w:t>
+      </w:r>
+    </w:p>
+    <w:p>
+      <w:pPr>
+        <w:shd w:val="clear" w:color="auto" w:fill="121314"/>
+        <w:spacing w:after="0" w:line="285" w:lineRule="atLeast"/>
+        <w:jc w:val="left"/>
+        <w:rPr>
+          <w:rFonts w:ascii="Consolas" w:eastAsia="Times New Roman" w:hAnsi="Consolas" w:cs="Times New Roman"/>
+          <w:color w:val="B5CEA8"/>
+          <w:sz w:val="21"/>
+        </w:rPr>
+      </w:pPr>
+      <w:r>
+        <w:rPr>
+          <w:rFonts w:ascii="Consolas" w:eastAsia="Times New Roman" w:hAnsi="Consolas" w:cs="Times New Roman"/>
+          <w:color w:val="C9D1D9"/>
+          <w:sz w:val="21"/>
+        </w:rPr>
+        <w:t>emp1</w:t>
+      </w:r>
+      <w:r>
+        <w:rPr>
+          <w:rFonts w:ascii="Consolas" w:eastAsia="Times New Roman" w:hAnsi="Consolas" w:cs="Times New Roman"/>
+          <w:color w:val="BBBEBF"/>
+          <w:sz w:val="21"/>
+        </w:rPr>
+        <w:t xml:space="preserve">.age </w:t>
+      </w:r>
+      <w:r>
+        <w:rPr>
+          <w:rFonts w:ascii="Consolas" w:eastAsia="Times New Roman" w:hAnsi="Consolas" w:cs="Times New Roman"/>
+          <w:color w:val="D4D4D4"/>
+          <w:sz w:val="21"/>
+        </w:rPr>
+        <w:t>=</w:t>
+      </w:r>
+      <w:r>
+        <w:rPr>
+          <w:rFonts w:ascii="Consolas" w:eastAsia="Times New Roman" w:hAnsi="Consolas" w:cs="Times New Roman"/>
+          <w:color w:val="BBBEBF"/>
+          <w:sz w:val="21"/>
+        </w:rPr>
+        <w:t xml:space="preserve"> </w:t>
+      </w:r>
+      <w:r>
+        <w:rPr>
+          <w:rFonts w:ascii="Consolas" w:eastAsia="Times New Roman" w:hAnsi="Consolas" w:cs="Times New Roman"/>
+          <w:color w:val="B5CEA8"/>
+          <w:sz w:val="21"/>
+        </w:rPr>
+        <w:t>20</w:t>
+      </w:r>
+    </w:p>
+    <w:p>
+      <w:pPr>
+        <w:shd w:val="clear" w:color="auto" w:fill="121314"/>
+        <w:spacing w:after="0" w:line="285" w:lineRule="atLeast"/>
+        <w:jc w:val="left"/>
+        <w:rPr>
+          <w:rFonts w:ascii="Consolas" w:eastAsia="Times New Roman" w:hAnsi="Consolas" w:cs="Times New Roman"/>
+          <w:color w:val="BBBEBF"/>
+          <w:sz w:val="21"/>
+        </w:rPr>
+      </w:pPr>
+      <w:r>
+        <w:rPr>
+          <w:rFonts w:ascii="Consolas" w:eastAsia="Times New Roman" w:hAnsi="Consolas" w:cs="Times New Roman"/>
+          <w:color w:val="B5CEA8"/>
+          <w:sz w:val="21"/>
+        </w:rPr>
+        <w:t xml:space="preserve">emp2.name = </w:t>
+      </w:r>
+      <w:r>
+        <w:rPr>
+          <w:rFonts w:ascii="Consolas" w:eastAsia="Times New Roman" w:hAnsi="Consolas" w:cs="Times New Roman"/>
+          <w:color w:val="A5D6FF"/>
+          <w:sz w:val="21"/>
+        </w:rPr>
+        <w:t>“MAYA”</w:t>
+      </w:r>
+    </w:p>
+    <w:p>
+      <w:pPr>
+        <w:shd w:val="clear" w:color="auto" w:fill="121314"/>
+        <w:spacing w:after="0" w:line="285" w:lineRule="atLeast"/>
+        <w:jc w:val="left"/>
+        <w:rPr>
+          <w:rFonts w:ascii="Consolas" w:eastAsia="Times New Roman" w:hAnsi="Consolas" w:cs="Times New Roman"/>
+          <w:color w:val="BBBEBF"/>
+          <w:sz w:val="21"/>
+        </w:rPr>
+      </w:pPr>
+    </w:p>
+    <w:p>
+      <w:pPr>
+        <w:shd w:val="clear" w:color="auto" w:fill="121314"/>
+        <w:spacing w:after="0" w:line="285" w:lineRule="atLeast"/>
+        <w:jc w:val="left"/>
+        <w:rPr>
+          <w:rFonts w:ascii="Consolas" w:eastAsia="Times New Roman" w:hAnsi="Consolas" w:cs="Times New Roman"/>
+          <w:color w:val="BBBEBF"/>
+          <w:sz w:val="21"/>
+        </w:rPr>
+      </w:pPr>
+      <w:r>
+        <w:rPr>
+          <w:rFonts w:ascii="Consolas" w:eastAsia="Times New Roman" w:hAnsi="Consolas" w:cs="Times New Roman"/>
+          <w:color w:val="D2A8FF"/>
+          <w:sz w:val="21"/>
+        </w:rPr>
+        <w:t>print</w:t>
+      </w:r>
+      <w:r>
+        <w:rPr>
+          <w:rFonts w:ascii="Consolas" w:eastAsia="Times New Roman" w:hAnsi="Consolas" w:cs="Times New Roman"/>
+          <w:color w:val="BBBEBF"/>
+          <w:sz w:val="21"/>
+        </w:rPr>
+        <w:t>(</w:t>
+      </w:r>
+      <w:r>
+        <w:rPr>
+          <w:rFonts w:ascii="Consolas" w:eastAsia="Times New Roman" w:hAnsi="Consolas" w:cs="Times New Roman"/>
+          <w:color w:val="C9D1D9"/>
+          <w:sz w:val="21"/>
+        </w:rPr>
+        <w:t>emp1</w:t>
+      </w:r>
+      <w:r>
+        <w:rPr>
+          <w:rFonts w:ascii="Consolas" w:eastAsia="Times New Roman" w:hAnsi="Consolas" w:cs="Times New Roman"/>
+          <w:color w:val="BBBEBF"/>
+          <w:sz w:val="21"/>
+        </w:rPr>
+        <w:t xml:space="preserve">.name, </w:t>
+      </w:r>
+      <w:proofErr w:type="gramStart"/>
+      <w:r>
+        <w:rPr>
+          <w:rFonts w:ascii="Consolas" w:eastAsia="Times New Roman" w:hAnsi="Consolas" w:cs="Times New Roman"/>
+          <w:color w:val="C9D1D9"/>
+          <w:sz w:val="21"/>
+        </w:rPr>
+        <w:t>emp1</w:t>
+      </w:r>
+      <w:r>
+        <w:rPr>
+          <w:rFonts w:ascii="Consolas" w:eastAsia="Times New Roman" w:hAnsi="Consolas" w:cs="Times New Roman"/>
+          <w:color w:val="BBBEBF"/>
+          <w:sz w:val="21"/>
+        </w:rPr>
+        <w:t>.</w:t>
+      </w:r>
+      <w:r>
+        <w:rPr>
+          <w:rFonts w:ascii="Consolas" w:eastAsia="Times New Roman" w:hAnsi="Consolas" w:cs="Times New Roman"/>
+          <w:color w:val="C9D1D9"/>
+          <w:sz w:val="21"/>
+        </w:rPr>
+        <w:t>company</w:t>
+      </w:r>
+      <w:r>
+        <w:rPr>
+          <w:rFonts w:ascii="Consolas" w:eastAsia="Times New Roman" w:hAnsi="Consolas" w:cs="Times New Roman"/>
+          <w:color w:val="BBBEBF"/>
+          <w:sz w:val="21"/>
+        </w:rPr>
+        <w:t>,</w:t>
+      </w:r>
+      <w:r>
+        <w:rPr>
+          <w:rFonts w:ascii="Consolas" w:eastAsia="Times New Roman" w:hAnsi="Consolas" w:cs="Times New Roman"/>
+          <w:color w:val="C9D1D9"/>
+          <w:sz w:val="21"/>
+        </w:rPr>
+        <w:t>emp1</w:t>
+      </w:r>
+      <w:r>
+        <w:rPr>
+          <w:rFonts w:ascii="Consolas" w:eastAsia="Times New Roman" w:hAnsi="Consolas" w:cs="Times New Roman"/>
+          <w:color w:val="BBBEBF"/>
+          <w:sz w:val="21"/>
+        </w:rPr>
+        <w:t>.age</w:t>
+      </w:r>
+      <w:proofErr w:type="gramEnd"/>
+      <w:r>
+        <w:rPr>
+          <w:rFonts w:ascii="Consolas" w:eastAsia="Times New Roman" w:hAnsi="Consolas" w:cs="Times New Roman"/>
+          <w:color w:val="BBBEBF"/>
+          <w:sz w:val="21"/>
+        </w:rPr>
+        <w:t>)</w:t>
+      </w:r>
+    </w:p>
+    <w:p>
+      <w:pPr>
+        <w:pStyle w:val="NormalWeb"/>
+      </w:pPr>
+      <w:r>
+        <w:t xml:space="preserve">Here, </w:t>
+      </w:r>
+      <w:r>
+        <w:rPr>
           <w:rStyle w:val="HTMLCode"/>
           <w:rFonts w:eastAsiaTheme="majorEastAsia"/>
         </w:rPr>
-        <w:t>:</w:t>
-      </w:r>
-      <w:r>
-        <w:br/>
-      </w:r>
-      <w:r>
-        <w:rPr>
-          <w:rStyle w:val="HTMLCode"/>
-          <w:rFonts w:eastAsiaTheme="majorEastAsia"/>
-        </w:rPr>
-        <w:t xml:space="preserve">    </w:t>
-      </w:r>
-      <w:r>
-        <w:rPr>
-          <w:rStyle w:val="11"/>
-        </w:rPr>
-        <w:t>company</w:t>
-      </w:r>
-      <w:r>
-        <w:rPr>
-          <w:rStyle w:val="HTMLCode"/>
-          <w:rFonts w:eastAsiaTheme="majorEastAsia"/>
-        </w:rPr>
-        <w:t xml:space="preserve"> </w:t>
-      </w:r>
-      <w:r>
-        <w:rPr>
-          <w:rStyle w:val="v"/>
-          <w:rFonts w:eastAsiaTheme="majorEastAsia"/>
-        </w:rPr>
-        <w:t>=</w:t>
-      </w:r>
-      <w:r>
-        <w:rPr>
-          <w:rStyle w:val="HTMLCode"/>
-          <w:rFonts w:eastAsiaTheme="majorEastAsia"/>
-        </w:rPr>
-        <w:t xml:space="preserve"> </w:t>
-      </w:r>
-      <w:r>
-        <w:rPr>
-          <w:rStyle w:val="z"/>
-        </w:rPr>
-        <w:t>"Google"</w:t>
-      </w:r>
-      <w:r>
-        <w:rPr>
-          <w:rStyle w:val="HTMLCode"/>
-          <w:rFonts w:eastAsiaTheme="majorEastAsia"/>
-        </w:rPr>
-        <w:t xml:space="preserve">   </w:t>
-      </w:r>
-      <w:r>
-        <w:rPr>
-          <w:rStyle w:val="t"/>
-        </w:rPr>
-        <w:t># Class attribute</w:t>
-      </w:r>
-      <w:r>
-        <w:br/>
-      </w:r>
-      <w:r>
-        <w:br/>
-      </w:r>
-      <w:r>
-        <w:rPr>
-          <w:rStyle w:val="11"/>
-        </w:rPr>
-        <w:t>emp1</w:t>
-      </w:r>
-      <w:r>
-        <w:rPr>
-          <w:rStyle w:val="HTMLCode"/>
-          <w:rFonts w:eastAsiaTheme="majorEastAsia"/>
-        </w:rPr>
-        <w:t xml:space="preserve"> </w:t>
-      </w:r>
-      <w:r>
-        <w:rPr>
-          <w:rStyle w:val="v"/>
-          <w:rFonts w:eastAsiaTheme="majorEastAsia"/>
-        </w:rPr>
-        <w:t>=</w:t>
-      </w:r>
-      <w:r>
-        <w:rPr>
-          <w:rStyle w:val="HTMLCode"/>
-          <w:rFonts w:eastAsiaTheme="majorEastAsia"/>
-        </w:rPr>
-        <w:t xml:space="preserve"> </w:t>
-      </w:r>
-      <w:r>
-        <w:rPr>
-          <w:rStyle w:val="11"/>
-        </w:rPr>
-        <w:t>Employee</w:t>
-      </w:r>
-      <w:r>
-        <w:rPr>
-          <w:rStyle w:val="HTMLCode"/>
-          <w:rFonts w:eastAsiaTheme="majorEastAsia"/>
-        </w:rPr>
-        <w:t>()</w:t>
-      </w:r>
-      <w:r>
-        <w:br/>
-      </w:r>
-      <w:r>
-        <w:rPr>
-          <w:rStyle w:val="11"/>
-        </w:rPr>
-        <w:t>emp2</w:t>
-      </w:r>
-      <w:r>
-        <w:rPr>
-          <w:rStyle w:val="HTMLCode"/>
-          <w:rFonts w:eastAsiaTheme="majorEastAsia"/>
-        </w:rPr>
-        <w:t xml:space="preserve"> </w:t>
-      </w:r>
-      <w:r>
-        <w:rPr>
-          <w:rStyle w:val="v"/>
-          <w:rFonts w:eastAsiaTheme="majorEastAsia"/>
-        </w:rPr>
-        <w:t>=</w:t>
-      </w:r>
-      <w:r>
-        <w:rPr>
-          <w:rStyle w:val="HTMLCode"/>
-          <w:rFonts w:eastAsiaTheme="majorEastAsia"/>
-        </w:rPr>
-        <w:t xml:space="preserve"> </w:t>
-      </w:r>
-      <w:r>
-        <w:rPr>
-          <w:rStyle w:val="11"/>
-        </w:rPr>
-        <w:t>Employee</w:t>
-      </w:r>
-      <w:r>
-        <w:rPr>
-          <w:rStyle w:val="HTMLCode"/>
-          <w:rFonts w:eastAsiaTheme="majorEastAsia"/>
-        </w:rPr>
-        <w:t>()</w:t>
-      </w:r>
-      <w:r>
-        <w:br/>
-      </w:r>
-      <w:r>
-        <w:br/>
-      </w:r>
-      <w:r>
-        <w:rPr>
-          <w:rStyle w:val="11"/>
-        </w:rPr>
-        <w:t>print</w:t>
-      </w:r>
-      <w:r>
-        <w:rPr>
-          <w:rStyle w:val="HTMLCode"/>
-          <w:rFonts w:eastAsiaTheme="majorEastAsia"/>
-        </w:rPr>
-        <w:t>(</w:t>
-      </w:r>
-      <w:r>
-        <w:rPr>
-          <w:rStyle w:val="11"/>
-        </w:rPr>
-        <w:t>emp1</w:t>
-      </w:r>
-      <w:r>
-        <w:rPr>
-          <w:rStyle w:val="v"/>
-          <w:rFonts w:eastAsiaTheme="majorEastAsia"/>
-        </w:rPr>
-        <w:t>.</w:t>
-      </w:r>
-      <w:r>
-        <w:rPr>
-          <w:rStyle w:val="HTMLCode"/>
-          <w:rFonts w:eastAsiaTheme="majorEastAsia"/>
-        </w:rPr>
-        <w:t xml:space="preserve">company)   </w:t>
-      </w:r>
-      <w:r>
-        <w:rPr>
-          <w:rStyle w:val="t"/>
-        </w:rPr>
-        <w:t># Google</w:t>
-      </w:r>
-      <w:r>
-        <w:br/>
-      </w:r>
-      <w:r>
-        <w:rPr>
-          <w:rStyle w:val="11"/>
-        </w:rPr>
-        <w:t>print</w:t>
-      </w:r>
-      <w:r>
-        <w:rPr>
-          <w:rStyle w:val="HTMLCode"/>
-          <w:rFonts w:eastAsiaTheme="majorEastAsia"/>
-        </w:rPr>
-        <w:t>(</w:t>
-      </w:r>
-      <w:r>
-        <w:rPr>
-          <w:rStyle w:val="11"/>
-        </w:rPr>
-        <w:t>emp2</w:t>
-      </w:r>
-      <w:r>
-        <w:rPr>
-          <w:rStyle w:val="v"/>
-          <w:rFonts w:eastAsiaTheme="majorEastAsia"/>
-        </w:rPr>
-        <w:t>.</w:t>
-      </w:r>
-      <w:r>
-        <w:rPr>
-          <w:rStyle w:val="HTMLCode"/>
-          <w:rFonts w:eastAsiaTheme="majorEastAsia"/>
-        </w:rPr>
-        <w:t xml:space="preserve">company)   </w:t>
-      </w:r>
-      <w:r>
-        <w:rPr>
-          <w:rStyle w:val="t"/>
-        </w:rPr>
-        <w:t># Google</w:t>
-      </w:r>
-    </w:p>
-    <w:p>
-      <w:pPr>
-        <w:pStyle w:val="NormalWeb"/>
-      </w:pPr>
-      <w:r>
-        <w:t xml:space="preserve">Both </w:t>
-      </w:r>
-      <w:r>
-        <w:rPr>
-          <w:rStyle w:val="HTMLCode"/>
-          <w:rFonts w:eastAsiaTheme="majorEastAsia"/>
-        </w:rPr>
-        <w:t>emp1</w:t>
-      </w:r>
-      <w:r>
-        <w:t xml:space="preserve"> and </w:t>
-      </w:r>
-      <w:r>
-        <w:rPr>
-          <w:rStyle w:val="HTMLCode"/>
-          <w:rFonts w:eastAsiaTheme="majorEastAsia"/>
-        </w:rPr>
-        <w:t>emp2</w:t>
-      </w:r>
-      <w:r>
-        <w:t xml:space="preserve"> share the same </w:t>
-      </w:r>
-      <w:r>
-        <w:rPr>
-          <w:rStyle w:val="HTMLCode"/>
-          <w:rFonts w:eastAsiaTheme="majorEastAsia"/>
-        </w:rPr>
-        <w:t>company</w:t>
-      </w:r>
-      <w:r>
-        <w:t xml:space="preserve"> value.</w:t>
-      </w:r>
-    </w:p>
-    <w:p>
-      <w:r>
-        <w:pict>
-          <v:rect id="_x0000_i1084" style="width:0;height:1.5pt" o:hralign="center" o:hrstd="t" o:hr="t" fillcolor="#a0a0a0" stroked="f"/>
-        </w:pict>
+        <w:t>name</w:t>
+      </w:r>
+      <w:r>
+        <w:t xml:space="preserve"> is an </w:t>
+      </w:r>
+      <w:r>
+        <w:rPr>
+          <w:rStyle w:val="Strong"/>
+          <w:rFonts w:eastAsiaTheme="majorEastAsia"/>
+        </w:rPr>
+        <w:t>object attribute</w:t>
+      </w:r>
+      <w:r>
+        <w:t xml:space="preserve"> because each object has its own value.</w:t>
       </w:r>
     </w:p>
     <w:p>
@@ -3706,478 +4554,27 @@
         <w:pStyle w:val="Heading2"/>
       </w:pPr>
       <w:r>
-        <w:t>Object (Instance) Attribute (Exam Definition)</w:t>
-      </w:r>
-    </w:p>
-    <w:p>
-      <w:pPr>
-        <w:pStyle w:val="NormalWeb"/>
-      </w:pPr>
-      <w:r>
-        <w:t xml:space="preserve">An </w:t>
-      </w:r>
-      <w:r>
-        <w:rPr>
-          <w:rStyle w:val="Strong"/>
-          <w:rFonts w:eastAsiaTheme="majorEastAsia"/>
-        </w:rPr>
-        <w:t>object attribute</w:t>
-      </w:r>
-      <w:r>
-        <w:t xml:space="preserve"> (or </w:t>
-      </w:r>
-      <w:r>
-        <w:rPr>
-          <w:rStyle w:val="Strong"/>
-          <w:rFonts w:eastAsiaTheme="majorEastAsia"/>
-        </w:rPr>
-        <w:t>instance attribute</w:t>
-      </w:r>
-      <w:r>
-        <w:t xml:space="preserve">) is a variable that belongs to a </w:t>
-      </w:r>
-      <w:r>
-        <w:rPr>
-          <w:rStyle w:val="Strong"/>
-          <w:rFonts w:eastAsiaTheme="majorEastAsia"/>
-        </w:rPr>
-        <w:t>specific object</w:t>
-      </w:r>
-      <w:r>
-        <w:t xml:space="preserve">. Each object can have its </w:t>
-      </w:r>
-      <w:r>
-        <w:rPr>
-          <w:rStyle w:val="Strong"/>
-          <w:rFonts w:eastAsiaTheme="majorEastAsia"/>
-        </w:rPr>
-        <w:t>own different value</w:t>
-      </w:r>
-      <w:r>
-        <w:t>.</w:t>
-      </w:r>
-    </w:p>
-    <w:p>
-      <w:pPr>
-        <w:pStyle w:val="NormalWeb"/>
-      </w:pPr>
-      <w:r>
-        <w:rPr>
-          <w:rStyle w:val="Strong"/>
-          <w:rFonts w:eastAsiaTheme="majorEastAsia"/>
-        </w:rPr>
-        <w:t>Example:</w:t>
-      </w:r>
-    </w:p>
-    <w:p>
-      <w:pPr>
-        <w:pStyle w:val="HTMLPreformatted"/>
-      </w:pPr>
-      <w:r>
-        <w:rPr>
-          <w:rStyle w:val="v"/>
-          <w:rFonts w:eastAsiaTheme="majorEastAsia"/>
-        </w:rPr>
-        <w:t>class</w:t>
-      </w:r>
-      <w:r>
-        <w:rPr>
-          <w:rStyle w:val="HTMLCode"/>
-          <w:rFonts w:eastAsiaTheme="majorEastAsia"/>
-        </w:rPr>
-        <w:t xml:space="preserve"> </w:t>
-      </w:r>
-      <w:r>
-        <w:rPr>
-          <w:rStyle w:val="10"/>
-          <w:rFonts w:eastAsiaTheme="majorEastAsia"/>
-        </w:rPr>
-        <w:t>Employee</w:t>
-      </w:r>
-      <w:r>
-        <w:rPr>
-          <w:rStyle w:val="HTMLCode"/>
-          <w:rFonts w:eastAsiaTheme="majorEastAsia"/>
-        </w:rPr>
-        <w:t>:</w:t>
-      </w:r>
-      <w:r>
-        <w:br/>
-      </w:r>
-      <w:r>
-        <w:rPr>
-          <w:rStyle w:val="HTMLCode"/>
-          <w:rFonts w:eastAsiaTheme="majorEastAsia"/>
-        </w:rPr>
-        <w:t xml:space="preserve">    </w:t>
-      </w:r>
-      <w:r>
-        <w:rPr>
-          <w:rStyle w:val="11"/>
-        </w:rPr>
-        <w:t>company</w:t>
-      </w:r>
-      <w:r>
-        <w:rPr>
-          <w:rStyle w:val="HTMLCode"/>
-          <w:rFonts w:eastAsiaTheme="majorEastAsia"/>
-        </w:rPr>
-        <w:t xml:space="preserve"> </w:t>
-      </w:r>
-      <w:r>
-        <w:rPr>
-          <w:rStyle w:val="v"/>
-          <w:rFonts w:eastAsiaTheme="majorEastAsia"/>
-        </w:rPr>
-        <w:t>=</w:t>
-      </w:r>
-      <w:r>
-        <w:rPr>
-          <w:rStyle w:val="HTMLCode"/>
-          <w:rFonts w:eastAsiaTheme="majorEastAsia"/>
-        </w:rPr>
-        <w:t xml:space="preserve"> </w:t>
-      </w:r>
-      <w:r>
-        <w:rPr>
-          <w:rStyle w:val="z"/>
-        </w:rPr>
-        <w:t>"Google"</w:t>
-      </w:r>
-      <w:r>
-        <w:br/>
-      </w:r>
-      <w:r>
-        <w:br/>
-      </w:r>
-      <w:r>
-        <w:rPr>
-          <w:rStyle w:val="11"/>
-        </w:rPr>
-        <w:t>emp1</w:t>
-      </w:r>
-      <w:r>
-        <w:rPr>
-          <w:rStyle w:val="HTMLCode"/>
-          <w:rFonts w:eastAsiaTheme="majorEastAsia"/>
-        </w:rPr>
-        <w:t xml:space="preserve"> </w:t>
-      </w:r>
-      <w:r>
-        <w:rPr>
-          <w:rStyle w:val="v"/>
-          <w:rFonts w:eastAsiaTheme="majorEastAsia"/>
-        </w:rPr>
-        <w:t>=</w:t>
-      </w:r>
-      <w:r>
-        <w:rPr>
-          <w:rStyle w:val="HTMLCode"/>
-          <w:rFonts w:eastAsiaTheme="majorEastAsia"/>
-        </w:rPr>
-        <w:t xml:space="preserve"> </w:t>
-      </w:r>
-      <w:r>
-        <w:rPr>
-          <w:rStyle w:val="11"/>
-        </w:rPr>
-        <w:t>Employee</w:t>
-      </w:r>
-      <w:r>
-        <w:rPr>
-          <w:rStyle w:val="HTMLCode"/>
-          <w:rFonts w:eastAsiaTheme="majorEastAsia"/>
-        </w:rPr>
-        <w:t>()</w:t>
-      </w:r>
-      <w:r>
-        <w:br/>
-      </w:r>
-      <w:r>
-        <w:rPr>
-          <w:rStyle w:val="11"/>
-        </w:rPr>
-        <w:t>emp2</w:t>
-      </w:r>
-      <w:r>
-        <w:rPr>
-          <w:rStyle w:val="HTMLCode"/>
-          <w:rFonts w:eastAsiaTheme="majorEastAsia"/>
-        </w:rPr>
-        <w:t xml:space="preserve"> </w:t>
-      </w:r>
-      <w:r>
-        <w:rPr>
-          <w:rStyle w:val="v"/>
-          <w:rFonts w:eastAsiaTheme="majorEastAsia"/>
-        </w:rPr>
-        <w:t>=</w:t>
-      </w:r>
-      <w:r>
-        <w:rPr>
-          <w:rStyle w:val="HTMLCode"/>
-          <w:rFonts w:eastAsiaTheme="majorEastAsia"/>
-        </w:rPr>
-        <w:t xml:space="preserve"> </w:t>
-      </w:r>
-      <w:r>
-        <w:rPr>
-          <w:rStyle w:val="11"/>
-        </w:rPr>
-        <w:t>Employee</w:t>
-      </w:r>
-      <w:r>
-        <w:rPr>
-          <w:rStyle w:val="HTMLCode"/>
-          <w:rFonts w:eastAsiaTheme="majorEastAsia"/>
-        </w:rPr>
-        <w:t>()</w:t>
-      </w:r>
-      <w:r>
-        <w:br/>
-      </w:r>
-      <w:r>
-        <w:br/>
-      </w:r>
-      <w:r>
-        <w:rPr>
-          <w:rStyle w:val="11"/>
-        </w:rPr>
-        <w:t>emp1</w:t>
-      </w:r>
-      <w:r>
-        <w:rPr>
-          <w:rStyle w:val="v"/>
-          <w:rFonts w:eastAsiaTheme="majorEastAsia"/>
-        </w:rPr>
-        <w:t>.</w:t>
-      </w:r>
-      <w:r>
-        <w:rPr>
-          <w:rStyle w:val="HTMLCode"/>
-          <w:rFonts w:eastAsiaTheme="majorEastAsia"/>
-        </w:rPr>
-        <w:t xml:space="preserve">name </w:t>
-      </w:r>
-      <w:r>
-        <w:rPr>
-          <w:rStyle w:val="v"/>
-          <w:rFonts w:eastAsiaTheme="majorEastAsia"/>
-        </w:rPr>
-        <w:t>=</w:t>
-      </w:r>
-      <w:r>
-        <w:rPr>
-          <w:rStyle w:val="HTMLCode"/>
-          <w:rFonts w:eastAsiaTheme="majorEastAsia"/>
-        </w:rPr>
-        <w:t xml:space="preserve"> </w:t>
-      </w:r>
-      <w:r>
-        <w:rPr>
-          <w:rStyle w:val="z"/>
-        </w:rPr>
-        <w:t>"Ali"</w:t>
-      </w:r>
-      <w:r>
-        <w:br/>
-      </w:r>
-      <w:r>
-        <w:rPr>
-          <w:rStyle w:val="11"/>
-        </w:rPr>
-        <w:t>emp2</w:t>
-      </w:r>
-      <w:r>
-        <w:rPr>
-          <w:rStyle w:val="v"/>
-          <w:rFonts w:eastAsiaTheme="majorEastAsia"/>
-        </w:rPr>
-        <w:t>.</w:t>
-      </w:r>
-      <w:r>
-        <w:rPr>
-          <w:rStyle w:val="HTMLCode"/>
-          <w:rFonts w:eastAsiaTheme="majorEastAsia"/>
-        </w:rPr>
-        <w:t xml:space="preserve">name </w:t>
-      </w:r>
-      <w:r>
-        <w:rPr>
-          <w:rStyle w:val="v"/>
-          <w:rFonts w:eastAsiaTheme="majorEastAsia"/>
-        </w:rPr>
-        <w:t>=</w:t>
-      </w:r>
-      <w:r>
-        <w:rPr>
-          <w:rStyle w:val="HTMLCode"/>
-          <w:rFonts w:eastAsiaTheme="majorEastAsia"/>
-        </w:rPr>
-        <w:t xml:space="preserve"> </w:t>
-      </w:r>
-      <w:r>
-        <w:rPr>
-          <w:rStyle w:val="z"/>
-        </w:rPr>
-        <w:t>"Maryam"</w:t>
-      </w:r>
-      <w:r>
-        <w:br/>
-      </w:r>
-      <w:r>
-        <w:br/>
-      </w:r>
-      <w:r>
-        <w:rPr>
-          <w:rStyle w:val="11"/>
-        </w:rPr>
-        <w:t>print</w:t>
-      </w:r>
-      <w:r>
-        <w:rPr>
-          <w:rStyle w:val="HTMLCode"/>
-          <w:rFonts w:eastAsiaTheme="majorEastAsia"/>
-        </w:rPr>
-        <w:t>(</w:t>
-      </w:r>
-      <w:r>
-        <w:rPr>
-          <w:rStyle w:val="11"/>
-        </w:rPr>
-        <w:t>emp1</w:t>
-      </w:r>
-      <w:r>
-        <w:rPr>
-          <w:rStyle w:val="v"/>
-          <w:rFonts w:eastAsiaTheme="majorEastAsia"/>
-        </w:rPr>
-        <w:t>.</w:t>
-      </w:r>
-      <w:r>
-        <w:rPr>
-          <w:rStyle w:val="HTMLCode"/>
-          <w:rFonts w:eastAsiaTheme="majorEastAsia"/>
-        </w:rPr>
-        <w:t xml:space="preserve">name)   </w:t>
-      </w:r>
-      <w:r>
-        <w:rPr>
-          <w:rStyle w:val="t"/>
-        </w:rPr>
-        <w:t># Ali</w:t>
-      </w:r>
-      <w:r>
-        <w:br/>
-      </w:r>
-      <w:r>
-        <w:rPr>
-          <w:rStyle w:val="11"/>
-        </w:rPr>
-        <w:t>print</w:t>
-      </w:r>
-      <w:r>
-        <w:rPr>
-          <w:rStyle w:val="HTMLCode"/>
-          <w:rFonts w:eastAsiaTheme="majorEastAsia"/>
-        </w:rPr>
-        <w:t>(</w:t>
-      </w:r>
-      <w:r>
-        <w:rPr>
-          <w:rStyle w:val="11"/>
-        </w:rPr>
-        <w:t>emp2</w:t>
-      </w:r>
-      <w:r>
-        <w:rPr>
-          <w:rStyle w:val="v"/>
-          <w:rFonts w:eastAsiaTheme="majorEastAsia"/>
-        </w:rPr>
-        <w:t>.</w:t>
-      </w:r>
-      <w:r>
-        <w:rPr>
-          <w:rStyle w:val="HTMLCode"/>
-          <w:rFonts w:eastAsiaTheme="majorEastAsia"/>
-        </w:rPr>
-        <w:t xml:space="preserve">name)   </w:t>
-      </w:r>
-      <w:r>
-        <w:rPr>
-          <w:rStyle w:val="t"/>
-        </w:rPr>
-        <w:t># Maryam</w:t>
-      </w:r>
-    </w:p>
-    <w:p>
-      <w:pPr>
-        <w:pStyle w:val="NormalWeb"/>
-      </w:pPr>
-      <w:r>
-        <w:t xml:space="preserve">Here, </w:t>
-      </w:r>
-      <w:r>
-        <w:rPr>
-          <w:rStyle w:val="HTMLCode"/>
-          <w:rFonts w:eastAsiaTheme="majorEastAsia"/>
-        </w:rPr>
-        <w:t>name</w:t>
-      </w:r>
-      <w:r>
-        <w:t xml:space="preserve"> is an </w:t>
-      </w:r>
-      <w:r>
-        <w:rPr>
-          <w:rStyle w:val="Strong"/>
-          <w:rFonts w:eastAsiaTheme="majorEastAsia"/>
-        </w:rPr>
-        <w:t>object attribute</w:t>
-      </w:r>
-      <w:r>
-        <w:t xml:space="preserve"> because each object has its own value.</w:t>
-      </w:r>
-    </w:p>
-    <w:p>
-      <w:r>
-        <w:pict>
-          <v:rect id="_x0000_i1085" style="width:0;height:1.5pt" o:hralign="center" o:hrstd="t" o:hr="t" fillcolor="#a0a0a0" stroked="f"/>
-        </w:pict>
-      </w:r>
-    </w:p>
-    <w:p>
-      <w:pPr>
-        <w:pStyle w:val="Heading2"/>
-      </w:pPr>
-      <w:r>
+        <w:lastRenderedPageBreak/>
         <w:t>Difference</w:t>
       </w:r>
     </w:p>
     <w:tbl>
       <w:tblPr>
-        <w:tblW w:w="0" w:type="auto"/>
-        <w:tblCellSpacing w:w="15" w:type="dxa"/>
-        <w:tblCellMar>
-          <w:top w:w="15" w:type="dxa"/>
-          <w:left w:w="15" w:type="dxa"/>
-          <w:bottom w:w="15" w:type="dxa"/>
-          <w:right w:w="15" w:type="dxa"/>
-        </w:tblCellMar>
+        <w:tblStyle w:val="TableGrid"/>
+        <w:tblW w:w="9320" w:type="dxa"/>
         <w:tblLook w:val="04A0" w:firstRow="1" w:lastRow="0" w:firstColumn="1" w:lastColumn="0" w:noHBand="0" w:noVBand="1"/>
       </w:tblPr>
       <w:tblGrid>
-        <w:gridCol w:w="2421"/>
-        <w:gridCol w:w="2908"/>
+        <w:gridCol w:w="4256"/>
+        <w:gridCol w:w="5064"/>
       </w:tblGrid>
       <w:tr>
         <w:trPr>
-          <w:tblHeader/>
-          <w:tblCellSpacing w:w="15" w:type="dxa"/>
+          <w:trHeight w:val="467"/>
         </w:trPr>
         <w:tc>
           <w:tcPr>
             <w:tcW w:w="0" w:type="auto"/>
-            <w:vAlign w:val="center"/>
             <w:hideMark/>
           </w:tcPr>
           <w:p>
@@ -4200,7 +4597,6 @@
         <w:tc>
           <w:tcPr>
             <w:tcW w:w="0" w:type="auto"/>
-            <w:vAlign w:val="center"/>
             <w:hideMark/>
           </w:tcPr>
           <w:p>
@@ -4223,12 +4619,11 @@
       </w:tr>
       <w:tr>
         <w:trPr>
-          <w:tblCellSpacing w:w="15" w:type="dxa"/>
+          <w:trHeight w:val="479"/>
         </w:trPr>
         <w:tc>
           <w:tcPr>
             <w:tcW w:w="0" w:type="auto"/>
-            <w:vAlign w:val="center"/>
             <w:hideMark/>
           </w:tcPr>
           <w:p>
@@ -4243,7 +4638,6 @@
         <w:tc>
           <w:tcPr>
             <w:tcW w:w="0" w:type="auto"/>
-            <w:vAlign w:val="center"/>
             <w:hideMark/>
           </w:tcPr>
           <w:p>
@@ -4255,17 +4649,15 @@
       </w:tr>
       <w:tr>
         <w:trPr>
-          <w:tblCellSpacing w:w="15" w:type="dxa"/>
+          <w:trHeight w:val="467"/>
         </w:trPr>
         <w:tc>
           <w:tcPr>
             <w:tcW w:w="0" w:type="auto"/>
-            <w:vAlign w:val="center"/>
             <w:hideMark/>
           </w:tcPr>
           <w:p>
             <w:r>
-              <w:lastRenderedPageBreak/>
               <w:t>Shared by all objects.</w:t>
             </w:r>
           </w:p>
@@ -4273,7 +4665,6 @@
         <w:tc>
           <w:tcPr>
             <w:tcW w:w="0" w:type="auto"/>
-            <w:vAlign w:val="center"/>
             <w:hideMark/>
           </w:tcPr>
           <w:p>
@@ -4285,12 +4676,11 @@
       </w:tr>
       <w:tr>
         <w:trPr>
-          <w:tblCellSpacing w:w="15" w:type="dxa"/>
+          <w:trHeight w:val="479"/>
         </w:trPr>
         <w:tc>
           <w:tcPr>
             <w:tcW w:w="0" w:type="auto"/>
-            <w:vAlign w:val="center"/>
             <w:hideMark/>
           </w:tcPr>
           <w:p>
@@ -4302,7 +4692,6 @@
         <w:tc>
           <w:tcPr>
             <w:tcW w:w="0" w:type="auto"/>
-            <w:vAlign w:val="center"/>
             <w:hideMark/>
           </w:tcPr>
           <w:p>
@@ -4374,18 +4763,14 @@
         <w:t>Different for everyone</w:t>
       </w:r>
       <w:r>
-        <w:t xml:space="preserve"> (e.g., Ali's name, Maryam's name) </w:t>
-      </w:r>
-    </w:p>
-    <w:p>
-      <w:pPr>
-        <w:pStyle w:val="z-BottomofForm"/>
-      </w:pPr>
-      <w:r>
-        <w:t>Bottom of Form</w:t>
-      </w:r>
-    </w:p>
-    <w:p/>
+        <w:t xml:space="preserve"> (e.g., Ali's name, Maryam's name)</w:t>
+      </w:r>
+      <w:r>
+        <w:t xml:space="preserve"> </w:t>
+      </w:r>
+      <w:bookmarkStart w:id="0" w:name="_GoBack"/>
+      <w:bookmarkEnd w:id="0"/>
+    </w:p>
     <w:sectPr>
       <w:pgSz w:w="12240" w:h="15840"/>
       <w:pgMar w:top="1440" w:right="1440" w:bottom="1440" w:left="1440" w:header="708" w:footer="708" w:gutter="0"/>
@@ -7454,7 +7839,6 @@
   <w:style w:type="character" w:default="1" w:styleId="DefaultParagraphFont">
     <w:name w:val="Default Paragraph Font"/>
     <w:uiPriority w:val="1"/>
-    <w:semiHidden/>
     <w:unhideWhenUsed/>
   </w:style>
   <w:style w:type="table" w:default="1" w:styleId="TableNormal">

</xml_diff>